<commit_message>
Physics Vol 3: Ch 14 adds 'A Worked Example: Grading the Simulation Hypothesis' and 'What If All the Signals Lie?'; Ch 17 adds the coarse self-simulation escape hatch; Contents cached page numbers updated; md mirror updated
</commit_message>
<xml_diff>
--- a/Physics, Actually - SERIES/Volume 3/Physics Vol 3 - The Standard Model, Chaos, and the Edge of Knowledge.docx
+++ b/Physics, Actually - SERIES/Volume 3/Physics Vol 3 - The Standard Model, Chaos, and the Edge of Knowledge.docx
@@ -925,7 +925,7 @@
           <w:rPr>
             <w:noProof/>
           </w:rPr>
-          <w:t>133</w:t>
+          <w:t>135</w:t>
         </w:r>
         <w:r>
           <w:fldChar w:fldCharType="end"/>
@@ -967,7 +967,7 @@
           <w:rPr>
             <w:noProof/>
           </w:rPr>
-          <w:t>134</w:t>
+          <w:t>136</w:t>
         </w:r>
         <w:r>
           <w:fldChar w:fldCharType="end"/>
@@ -1009,7 +1009,7 @@
           <w:rPr>
             <w:noProof/>
           </w:rPr>
-          <w:t>144</w:t>
+          <w:t>146</w:t>
         </w:r>
         <w:r>
           <w:fldChar w:fldCharType="end"/>
@@ -1051,7 +1051,7 @@
           <w:rPr>
             <w:noProof/>
           </w:rPr>
-          <w:t>153</w:t>
+          <w:t>155</w:t>
         </w:r>
         <w:r>
           <w:fldChar w:fldCharType="end"/>
@@ -1093,7 +1093,7 @@
           <w:rPr>
             <w:noProof/>
           </w:rPr>
-          <w:t>163</w:t>
+          <w:t>166</w:t>
         </w:r>
         <w:r>
           <w:fldChar w:fldCharType="end"/>
@@ -1135,7 +1135,7 @@
           <w:rPr>
             <w:noProof/>
           </w:rPr>
-          <w:t>166</w:t>
+          <w:t>169</w:t>
         </w:r>
         <w:r>
           <w:fldChar w:fldCharType="end"/>
@@ -1177,7 +1177,7 @@
           <w:rPr>
             <w:noProof/>
           </w:rPr>
-          <w:t>170</w:t>
+          <w:t>173</w:t>
         </w:r>
         <w:r>
           <w:fldChar w:fldCharType="end"/>
@@ -1219,7 +1219,7 @@
           <w:rPr>
             <w:noProof/>
           </w:rPr>
-          <w:t>173</w:t>
+          <w:t>176</w:t>
         </w:r>
         <w:r>
           <w:fldChar w:fldCharType="end"/>
@@ -9489,6 +9489,54 @@
         <w:pStyle w:val="Heading2"/>
       </w:pPr>
       <w:r>
+        <w:t xml:space="preserve">A Worked Example: Grading the Simulation Hypothesis</w:t>
+      </w:r>
+    </w:p>
+    <w:p>
+      <w:pPr>
+        <w:jc w:val="both"/>
+      </w:pPr>
+      <w:r>
+        <w:t xml:space="preserve">Here is a crazy idea people ask about more than almost any other: we are living inside a computer simulation. The philosopher Nick Bostrom gave it its modern form in 2003. If civilizations often become able to run detailed simulations of minds, and often choose to, then simulated minds would vastly outnumber original ones, and you should expect to be one of them. It is a serious argument about probabilities. Run it through the four boxes anyway.</w:t>
+      </w:r>
+    </w:p>
+    <w:p>
+      <w:pPr>
+        <w:jc w:val="both"/>
+      </w:pPr>
+      <w:r>
+        <w:t xml:space="preserve">Is it GREEN? No observation has ever confirmed it. YELLOW? A yellow idea is a powerful theory with incomplete support, which means it makes predictions that some future experiment could check. The simulation hypothesis, as usually stated, makes none that its own defenders would accept as decisive. Search for a pixel-like grain in spacetime and find none, and the reply is that the simulators used a finer grid. Find something strange, and the reply could just as easily be that physics is stranger than we thought.</w:t>
+      </w:r>
+    </w:p>
+    <w:p>
+      <w:pPr>
+        <w:jc w:val="both"/>
+      </w:pPr>
+      <w:r>
+        <w:t xml:space="preserve">That is the warning sign. Ask what could kill it. If the honest answer is nothing, the idea is not ORANGE either, because an orange idea still offers a mechanism that further work could test. Presented as a claim about our world, the simulation hypothesis belongs in the RED box. It is not a stupid idea. As presented, it is just not a scientific one.</w:t>
+      </w:r>
+    </w:p>
+    <w:p>
+      <w:pPr>
+        <w:jc w:val="both"/>
+      </w:pPr>
+      <w:r>
+        <w:t xml:space="preserve">Two narrower versions do better. The first gets specific: a universe computed on a particular kind of grid would leave particular marks on the highest-energy cosmic rays. That is testable, which moves it toward ORANGE, and so far the evidence has gone against it (Volume 2 of this series tells that story). The second is about cost. Simulating quantum matter exactly on an ordinary computer gets exponentially more expensive as the system grows. Each extra particle with two possible states doubles the list of numbers needed to describe it, and about three hundred such particles would need more numbers than there are atoms in the observable universe. That doesn’t prove a simulation is impossible, since a simulator might use a quantum computer or cut corners. It does show that “they just have a very big computer” is not an explanation.</w:t>
+      </w:r>
+    </w:p>
+    <w:p>
+      <w:pPr>
+        <w:jc w:val="both"/>
+      </w:pPr>
+      <w:r>
+        <w:t xml:space="preserve">The colors don’t end the conversation. They tell you what kind of conversation you are having.</w:t>
+      </w:r>
+    </w:p>
+    <w:p>
+      <w:pPr>
+        <w:pStyle w:val="Heading2"/>
+      </w:pPr>
+      <w:r>
         <w:t xml:space="preserve">The Reader’s Superpower</w:t>
       </w:r>
     </w:p>
@@ -9522,6 +9570,46 @@
       </w:pPr>
       <w:r>
         <w:t xml:space="preserve">Curious.</w:t>
+      </w:r>
+    </w:p>
+    <w:p>
+      <w:pPr>
+        <w:pStyle w:val="Heading2"/>
+      </w:pPr>
+      <w:r>
+        <w:t xml:space="preserve">What If All the Signals Lie?</w:t>
+      </w:r>
+    </w:p>
+    <w:p>
+      <w:pPr>
+        <w:jc w:val="both"/>
+      </w:pPr>
+      <w:r>
+        <w:t xml:space="preserve">One suspicion sounds as if it could end every argument in this book: what if all of it is fake? Every measurement here reached a physicist as a signal, whether a click, a voltage, a number on a screen or a pattern on a retina. A clever enough deceiver could, in principle, fake them all.</w:t>
+      </w:r>
+    </w:p>
+    <w:p>
+      <w:pPr>
+        <w:jc w:val="both"/>
+      </w:pPr>
+      <w:r>
+        <w:t xml:space="preserve">Philosophers have taken that worry seriously since René Descartes imagined a deceiving demon in 1641, and no experiment can rule it out completely, because any experiment would arrive as one more signal. But science does not need to defeat the demon to make progress. It needs something more modest: claims that keep agreeing when they are checked by routes that could each fail in different ways.</w:t>
+      </w:r>
+    </w:p>
+    <w:p>
+      <w:pPr>
+        <w:jc w:val="both"/>
+      </w:pPr>
+      <w:r>
+        <w:t xml:space="preserve">The Higgs boson was found by two separate detectors, ATLAS and CMS, built by separate teams with different technologies, and both saw a new particle near 125 GeV. A fake would have to be faked consistently across machines, teams and decades, and keep matching predictions written down before anyone looked. OPERA’s faster-than-light neutrinos failed exactly this test; the Higgs passed it. A deception that survived every cross-check would be indistinguishable from a world that really works that way, and no measurement can promise more than that.</w:t>
+      </w:r>
+    </w:p>
+    <w:p>
+      <w:pPr>
+        <w:jc w:val="both"/>
+      </w:pPr>
+      <w:r>
+        <w:t xml:space="preserve">So the honest answer to “What if the signals lie?” is not “They can’t.” It is this: then they lie in perfect agreement, across every independent route we have, and that agreement is what we mean by knowing.</w:t>
       </w:r>
     </w:p>
     <w:p>
@@ -11681,6 +11769,14 @@
       </w:pPr>
       <w:r>
         <w:t xml:space="preserve">Congratulations. You have invented the cosmic version of putting two mirrors opposite each other. The reflections keep going. The computer bill does too.</w:t>
+      </w:r>
+    </w:p>
+    <w:p>
+      <w:pPr>
+        <w:jc w:val="both"/>
+      </w:pPr>
+      <w:r>
+        <w:t xml:space="preserve">There is one escape hatch, and it is worth naming. A simulator does not have to copy itself at full resolution. A weather model doesn’t track every raindrop; it tracks averages on a grid and still forecasts tomorrow. A universe-sized computer could model itself the same way, coarsely, and the mirror regress would fade after a few reflections, each copy blurrier than the last. What it could not do is model itself completely, every particle included, the ones doing the modeling among them. A blurry self-portrait can be useful. It can’t be exact.</w:t>
       </w:r>
     </w:p>
     <w:p>

</xml_diff>

<commit_message>
Physics Vol 3: sync manuscript.md front/back matter (Also in This Series, Also by Lothar J. Musiol, A Note Before You Go were missing entirely); fix missing bold 'Life, Actually' series label in docx back matter
Co-Authored-By: Claude Sonnet 5 <noreply@anthropic.com>
Claude-Session: https://claude.ai/code/session_01KuuKGQeyeCjwqoaAqr8qL3
</commit_message>
<xml_diff>
--- a/Physics, Actually - SERIES/Volume 3/Physics Vol 3 - The Standard Model, Chaos, and the Edge of Knowledge.docx
+++ b/Physics, Actually - SERIES/Volume 3/Physics Vol 3 - The Standard Model, Chaos, and the Edge of Knowledge.docx
@@ -13673,6 +13673,14 @@
       </w:pPr>
       <w:r>
         <w:t xml:space="preserve">Physics, Actually, Volume 3: The Standard Model, Chaos, and the Edge of Knowledge</w:t>
+      </w:r>
+    </w:p>
+    <w:p>
+      <w:r>
+        <w:rPr>
+          <w:b/>
+        </w:rPr>
+        <w:t>Life, Actually</w:t>
       </w:r>
     </w:p>
     <w:p>

</xml_diff>

<commit_message>
Also by: Quantum, Actually Vol 1 and Vol 2 replace the Quanta, Actually entries (Math, Actually 1-4, Physics, Actually 1-3, Life, Actually, and their build scripts)
</commit_message>
<xml_diff>
--- a/Physics, Actually - SERIES/Volume 3/Physics Vol 3 - The Standard Model, Chaos, and the Edge of Knowledge.docx
+++ b/Physics, Actually - SERIES/Volume 3/Physics Vol 3 - The Standard Model, Chaos, and the Edge of Knowledge.docx
@@ -13750,7 +13750,7 @@
         <w:rPr>
           <w:b/>
         </w:rPr>
-        <w:t xml:space="preserve">Quanta, Actually</w:t>
+        <w:t xml:space="preserve">Quantum, Actually</w:t>
       </w:r>
     </w:p>
     <w:p>
@@ -13760,7 +13760,7 @@
         <w:jc w:val="left"/>
       </w:pPr>
       <w:r>
-        <w:t xml:space="preserve">Quanta, Actually, Volume 1: The Quantum World</w:t>
+        <w:t xml:space="preserve">Quantum, Actually, Volume 1: Questions and Answers from the Double Slit to the Superconducting Wire</w:t>
       </w:r>
     </w:p>
     <w:p>
@@ -13770,17 +13770,7 @@
         <w:jc w:val="left"/>
       </w:pPr>
       <w:r>
-        <w:t xml:space="preserve">Quanta, Actually, Volume 2: The Quantum Conversation</w:t>
-      </w:r>
-    </w:p>
-    <w:p>
-      <w:pPr>
-        <w:spacing w:before="0" w:after="20"/>
-        <w:ind w:left="360" w:firstLine="0" w:right="0"/>
-        <w:jc w:val="left"/>
-      </w:pPr>
-      <w:r>
-        <w:t xml:space="preserve">Quanta, Actually, Volume 3: Complete Quantum Electrodynamics Course</w:t>
+        <w:t xml:space="preserve">Quantum, Actually, Volume 2: A QED Course</w:t>
       </w:r>
     </w:p>
     <w:p>

</xml_diff>

<commit_message>
Physics, Actually Vols 1-3: claude/quirky-faraday-bhu8yq audit fixes (Vol 3 regressions, Life, Actually link in all four docx, repeated sentences, Vol 1 didactic gaps, Editorial_Review_2026-10-05.md) 3-way merged with Also-by edits; companion-book lines name Quantum, Actually [from book-2-lectures-after-qed d7ca770, paths only]
</commit_message>
<xml_diff>
--- a/Physics, Actually - SERIES/Volume 3/Physics Vol 3 - The Standard Model, Chaos, and the Edge of Knowledge.docx
+++ b/Physics, Actually - SERIES/Volume 3/Physics Vol 3 - The Standard Model, Chaos, and the Edge of Knowledge.docx
@@ -1701,7 +1701,7 @@
         <w:jc w:val="both"/>
       </w:pPr>
       <w:r>
-        <w:t xml:space="preserve">Because c² is enormous, a minuscule change in mass corresponds to a huge amount of energy. Run the actual arithmetic on one gram: multiply by c² — about 9×10¹⁶ in SI units — and that single gram, fully converted, is worth roughly 9×10¹³ joules. That is in the range of a small nuclear weapon, released from a scrap of mass you could balance on a coin.</w:t>
+        <w:t>Here m is the mass and c is the speed of light — about 300,000 kilometers per second. Because c² is enormous, a minuscule change in mass corresponds to a huge amount of energy. Run the actual arithmetic on one gram: multiply by c² — about 9×10¹⁶ in SI units — and that single gram, fully converted, is worth roughly 9×10¹³ joules. That is in the range of a small nuclear weapon, released from a scrap of mass you could balance on a coin.</w:t>
       </w:r>
     </w:p>
     <w:p>
@@ -2783,7 +2783,7 @@
         <w:jc w:val="both"/>
       </w:pPr>
       <w:r>
-        <w:t xml:space="preserve">It is so massive that it decays before it can form ordinary hadrons. We therefore do not find top-quark atoms or top-quark nuclei. We detect the top through the products of its extremely rapid decay.</w:t>
+        <w:t>It is so massive that it decays before it can form ordinary hadrons — the bound states, such as protons and pions, that quarks make when the strong force glues them together. We therefore do not find top-quark atoms or top-quark nuclei. We detect the top through the products of its extremely rapid decay.</w:t>
       </w:r>
     </w:p>
     <w:p>
@@ -2831,7 +2831,7 @@
         <w:jc w:val="both"/>
       </w:pPr>
       <w:r>
-        <w:t xml:space="preserve">The Higgs boson is different. It is the quantum excitation of the Higgs field and is associated with the Higgs mechanism that gives mass to the W and Z bosons and contributes to the masses of elementary fermions. Gravity is missing from this list. That omission is not a typo.</w:t>
+        <w:t>The Higgs boson is different. It is the quantum excitation of the Higgs field and is associated with the Higgs mechanism that gives mass to the W and Z bosons and contributes to the masses of elementary fermions — the matter particles, such as quarks and electrons, that everything around you is built from. Gravity is missing from this list. That omission is not a typo.</w:t>
       </w:r>
     </w:p>
     <w:p>
@@ -3031,7 +3031,7 @@
         <w:pStyle w:val="Heading2"/>
       </w:pPr>
       <w:r>
-        <w:t xml:space="preserve">Why three forces fit together</w:t>
+        <w:t>How the Forces Are Related</w:t>
       </w:r>
     </w:p>
     <w:p>
@@ -3047,7 +3047,7 @@
         <w:jc w:val="both"/>
       </w:pPr>
       <w:r>
-        <w:t xml:space="preserve">At ordinary energies, the electroweak symmetry is broken and the familiar photon, W, and Z appear as distinct particles. This is one of the great conceptual achievements of twentieth-century physics. Three apparently different interactions turn out to be manifestations of a common mathematical structure at high energy.</w:t>
+        <w:t>At ordinary energies, the electroweak symmetry is broken and the familiar photon, W, and Z appear as distinct particles. This is one of the great conceptual achievements of twentieth-century physics: two apparently different interactions turn out to be manifestations of a single mathematical structure at high energy. The strong interaction, described separately by quantum chromodynamics, has not been folded into that structure — only proposed, in the grand unified theories Part III returns to.</w:t>
       </w:r>
     </w:p>
     <w:p>
@@ -3071,7 +3071,7 @@
         <w:jc w:val="both"/>
       </w:pPr>
       <w:r>
-        <w:t xml:space="preserve">There are coupling constants. There are particle masses and mixing parameters. There are rules for how the fields interact. From those ingredients, the theory predicts a huge range of observed phenomena.</w:t>
+        <w:t>There are coupling constants — numbers that fix how strongly each force pulls. There are particle masses and mixing parameters. There are rules for how the fields interact. From those ingredients, the theory predicts a huge range of observed phenomena.</w:t>
       </w:r>
     </w:p>
     <w:p>
@@ -13676,6 +13676,14 @@
       </w:r>
     </w:p>
     <w:p>
+      <w:r>
+        <w:rPr>
+          <w:b/>
+        </w:rPr>
+        <w:t>Life, Actually</w:t>
+      </w:r>
+    </w:p>
+    <w:p>
       <w:pPr>
         <w:spacing w:before="0" w:after="20"/>
         <w:ind w:left="360" w:firstLine="0" w:right="0"/>
@@ -13750,7 +13758,7 @@
         <w:rPr>
           <w:b/>
         </w:rPr>
-        <w:t xml:space="preserve">Quanta, Actually</w:t>
+        <w:t xml:space="preserve">Quantum, Actually</w:t>
       </w:r>
     </w:p>
     <w:p>
@@ -13760,7 +13768,7 @@
         <w:jc w:val="left"/>
       </w:pPr>
       <w:r>
-        <w:t xml:space="preserve">Quanta, Actually, Volume 1: The Quantum World</w:t>
+        <w:t xml:space="preserve">Quantum, Actually, Volume 1: Questions and Answers from the Double Slit to the Superconducting Wire</w:t>
       </w:r>
     </w:p>
     <w:p>
@@ -13770,17 +13778,7 @@
         <w:jc w:val="left"/>
       </w:pPr>
       <w:r>
-        <w:t xml:space="preserve">Quanta, Actually, Volume 2: The Quantum Conversation</w:t>
-      </w:r>
-    </w:p>
-    <w:p>
-      <w:pPr>
-        <w:spacing w:before="0" w:after="20"/>
-        <w:ind w:left="360" w:firstLine="0" w:right="0"/>
-        <w:jc w:val="left"/>
-      </w:pPr>
-      <w:r>
-        <w:t xml:space="preserve">Quanta, Actually, Volume 3: Complete Quantum Electrodynamics Course</w:t>
+        <w:t xml:space="preserve">Quantum, Actually, Volume 2: A QED Course</w:t>
       </w:r>
     </w:p>
     <w:p>
@@ -14075,7 +14073,7 @@
         <w:jc w:val="both"/>
       </w:pPr>
       <w:r>
-        <w:t xml:space="preserve">This is the last numbered volume of Physics, Actually. If you came here first, the story starts earlier: motion, forces, light, time and special relativity in Volume 1, and gravity, black holes, the expanding universe and the first three minutes in Volume 2. Quantum mechanics, entanglement and quantum technology have a book of their own, the companion volume The Quantum World.</w:t>
+        <w:t xml:space="preserve">This is the last numbered volume of Physics, Actually. If you came here first, the story starts earlier: motion, forces, light, time and special relativity in Volume 1, and gravity, black holes, the expanding universe and the first three minutes in Volume 2. Quantum mechanics, entanglement and quantum technology have a book of their own, the companion volumes Quantum, Actually, Volume 1: Questions and Answers from the Double Slit to the Superconducting Wire and Quantum, Actually, Volume 2: A QED Course.</w:t>
       </w:r>
     </w:p>
     <w:p>

</xml_diff>

<commit_message>
Also-by: Physics, Actually Vols 1-3 and Life, Actually to canonical list
</commit_message>
<xml_diff>
--- a/Physics, Actually - SERIES/Volume 3/Physics Vol 3 - The Standard Model, Chaos, and the Edge of Knowledge.docx
+++ b/Physics, Actually - SERIES/Volume 3/Physics Vol 3 - The Standard Model, Chaos, and the Edge of Knowledge.docx
@@ -13672,24 +13672,6 @@
         <w:jc w:val="left"/>
       </w:pPr>
       <w:r>
-        <w:t xml:space="preserve">Physics, Actually, Volume 3: The Standard Model, Chaos, and the Edge of Knowledge</w:t>
-      </w:r>
-    </w:p>
-    <w:p>
-      <w:r>
-        <w:rPr>
-          <w:b/>
-        </w:rPr>
-        <w:t>Life, Actually</w:t>
-      </w:r>
-    </w:p>
-    <w:p>
-      <w:pPr>
-        <w:spacing w:before="0" w:after="20"/>
-        <w:ind w:left="360" w:firstLine="0" w:right="0"/>
-        <w:jc w:val="left"/>
-      </w:pPr>
-      <w:r>
         <w:t xml:space="preserve">Life, Actually: From the First Cell to the Edited Genome and the Search for Life Elsewhere</w:t>
       </w:r>
     </w:p>
@@ -13704,7 +13686,7 @@
         <w:rPr>
           <w:b/>
         </w:rPr>
-        <w:t xml:space="preserve">Math, Actually</w:t>
+        <w:t xml:space="preserve">More Actually Books</w:t>
       </w:r>
     </w:p>
     <w:p>
@@ -13714,7 +13696,7 @@
         <w:jc w:val="left"/>
       </w:pPr>
       <w:r>
-        <w:t xml:space="preserve">Math, Actually, Volume 1: From Arithmetic to Calculus</w:t>
+        <w:t xml:space="preserve">Gravitation, Actually: A Short Book on Gravity</w:t>
       </w:r>
     </w:p>
     <w:p>
@@ -13724,27 +13706,7 @@
         <w:jc w:val="left"/>
       </w:pPr>
       <w:r>
-        <w:t xml:space="preserve">Math, Actually, Volume 2: From Multivariable Calculus to Set Theory &amp; Logic</w:t>
-      </w:r>
-    </w:p>
-    <w:p>
-      <w:pPr>
-        <w:spacing w:before="0" w:after="20"/>
-        <w:ind w:left="360" w:firstLine="0" w:right="0"/>
-        <w:jc w:val="left"/>
-      </w:pPr>
-      <w:r>
-        <w:t xml:space="preserve">Math, Actually, Volume 3: From Differential Equations to Abstract Algebra</w:t>
-      </w:r>
-    </w:p>
-    <w:p>
-      <w:pPr>
-        <w:spacing w:before="0" w:after="20"/>
-        <w:ind w:left="360" w:firstLine="0" w:right="0"/>
-        <w:jc w:val="left"/>
-      </w:pPr>
-      <w:r>
-        <w:t xml:space="preserve">Math, Actually, Volume 4: From Category Theory to the Frontier</w:t>
+        <w:t xml:space="preserve">The Universe, Actually: What Humanity Currently Understands About Reality</w:t>
       </w:r>
     </w:p>
     <w:p>
@@ -13758,7 +13720,7 @@
         <w:rPr>
           <w:b/>
         </w:rPr>
-        <w:t xml:space="preserve">Quantum, Actually</w:t>
+        <w:t xml:space="preserve">Math, Actually</w:t>
       </w:r>
     </w:p>
     <w:p>
@@ -13768,7 +13730,7 @@
         <w:jc w:val="left"/>
       </w:pPr>
       <w:r>
-        <w:t xml:space="preserve">Quantum, Actually, Volume 1: Questions and Answers from the Double Slit to the Superconducting Wire</w:t>
+        <w:t xml:space="preserve">Math, Actually, Volume 1: From Arithmetic to Calculus</w:t>
       </w:r>
     </w:p>
     <w:p>
@@ -13778,7 +13740,27 @@
         <w:jc w:val="left"/>
       </w:pPr>
       <w:r>
-        <w:t xml:space="preserve">Quantum, Actually, Volume 2: A QED Course</w:t>
+        <w:t xml:space="preserve">Math, Actually, Volume 2: From Multivariable Calculus to Set Theory &amp; Logic</w:t>
+      </w:r>
+    </w:p>
+    <w:p>
+      <w:pPr>
+        <w:spacing w:before="0" w:after="20"/>
+        <w:ind w:left="360" w:firstLine="0" w:right="0"/>
+        <w:jc w:val="left"/>
+      </w:pPr>
+      <w:r>
+        <w:t xml:space="preserve">Math, Actually, Volume 3: From Differential Equations to Abstract Algebra</w:t>
+      </w:r>
+    </w:p>
+    <w:p>
+      <w:pPr>
+        <w:spacing w:before="0" w:after="20"/>
+        <w:ind w:left="360" w:firstLine="0" w:right="0"/>
+        <w:jc w:val="left"/>
+      </w:pPr>
+      <w:r>
+        <w:t xml:space="preserve">Math, Actually, Volume 4: From Category Theory to the Frontier</w:t>
       </w:r>
     </w:p>
     <w:p>
@@ -13792,7 +13774,7 @@
         <w:rPr>
           <w:b/>
         </w:rPr>
-        <w:t xml:space="preserve">Science Sparks</w:t>
+        <w:t xml:space="preserve">Quantum, Actually</w:t>
       </w:r>
     </w:p>
     <w:p>
@@ -13802,7 +13784,17 @@
         <w:jc w:val="left"/>
       </w:pPr>
       <w:r>
-        <w:t xml:space="preserve">Science Sparks: Physics, Life, and Mathematics — The Same Few Rules, Told in Highlights</w:t>
+        <w:t xml:space="preserve">Quantum, Actually, Volume 1: Questions and Answers from the Double Slit to the Superconducting Wire</w:t>
+      </w:r>
+    </w:p>
+    <w:p>
+      <w:pPr>
+        <w:spacing w:before="0" w:after="20"/>
+        <w:ind w:left="360" w:firstLine="0" w:right="0"/>
+        <w:jc w:val="left"/>
+      </w:pPr>
+      <w:r>
+        <w:t xml:space="preserve">Quantum, Actually, Volume 2: A QED Course</w:t>
       </w:r>
     </w:p>
     <w:p>
@@ -13816,7 +13808,7 @@
         <w:rPr>
           <w:b/>
         </w:rPr>
-        <w:t xml:space="preserve">Look First</w:t>
+        <w:t xml:space="preserve">Science Sparks</w:t>
       </w:r>
     </w:p>
     <w:p>
@@ -13826,17 +13818,7 @@
         <w:jc w:val="left"/>
       </w:pPr>
       <w:r>
-        <w:t xml:space="preserve">Look First, Volume 1: The Universe Has No Now</w:t>
-      </w:r>
-    </w:p>
-    <w:p>
-      <w:pPr>
-        <w:spacing w:before="0" w:after="20"/>
-        <w:ind w:left="360" w:firstLine="0" w:right="0"/>
-        <w:jc w:val="left"/>
-      </w:pPr>
-      <w:r>
-        <w:t xml:space="preserve">Look First, Volume 2: A Trip Is Not a New Life</w:t>
+        <w:t xml:space="preserve">Science Sparks: Physics, Life, and Mathematics — The Same Few Rules, Told in Highlights</w:t>
       </w:r>
     </w:p>
     <w:p>
@@ -13850,7 +13832,7 @@
         <w:rPr>
           <w:b/>
         </w:rPr>
-        <w:t xml:space="preserve">Electrical Engineering Series</w:t>
+        <w:t xml:space="preserve">Look First</w:t>
       </w:r>
     </w:p>
     <w:p>
@@ -13860,7 +13842,7 @@
         <w:jc w:val="left"/>
       </w:pPr>
       <w:r>
-        <w:t xml:space="preserve">Foundations of Electronics (Book 1)</w:t>
+        <w:t xml:space="preserve">Look First, Volume 1: The Universe Has No Now</w:t>
       </w:r>
     </w:p>
     <w:p>
@@ -13870,57 +13852,7 @@
         <w:jc w:val="left"/>
       </w:pPr>
       <w:r>
-        <w:t xml:space="preserve">Circuits, Components, and Control (Book 2)</w:t>
-      </w:r>
-    </w:p>
-    <w:p>
-      <w:pPr>
-        <w:spacing w:before="0" w:after="20"/>
-        <w:ind w:left="360" w:firstLine="0" w:right="0"/>
-        <w:jc w:val="left"/>
-      </w:pPr>
-      <w:r>
-        <w:t xml:space="preserve">Semiconductor Physics and Devices (Book 3)</w:t>
-      </w:r>
-    </w:p>
-    <w:p>
-      <w:pPr>
-        <w:spacing w:before="0" w:after="20"/>
-        <w:ind w:left="360" w:firstLine="0" w:right="0"/>
-        <w:jc w:val="left"/>
-      </w:pPr>
-      <w:r>
-        <w:t xml:space="preserve">RF, Microwave, and Transceivers (Book 4)</w:t>
-      </w:r>
-    </w:p>
-    <w:p>
-      <w:pPr>
-        <w:spacing w:before="0" w:after="20"/>
-        <w:ind w:left="360" w:firstLine="0" w:right="0"/>
-        <w:jc w:val="left"/>
-      </w:pPr>
-      <w:r>
-        <w:t xml:space="preserve">Communications, Wireless, and SDR (Book 5)</w:t>
-      </w:r>
-    </w:p>
-    <w:p>
-      <w:pPr>
-        <w:spacing w:before="0" w:after="20"/>
-        <w:ind w:left="360" w:firstLine="0" w:right="0"/>
-        <w:jc w:val="left"/>
-      </w:pPr>
-      <w:r>
-        <w:t xml:space="preserve">Power and Energy (Book 6)</w:t>
-      </w:r>
-    </w:p>
-    <w:p>
-      <w:pPr>
-        <w:spacing w:before="0" w:after="20"/>
-        <w:ind w:left="360" w:firstLine="0" w:right="0"/>
-        <w:jc w:val="left"/>
-      </w:pPr>
-      <w:r>
-        <w:t xml:space="preserve">Packaging, Layout, EMC, and Test (Book 7)</w:t>
+        <w:t xml:space="preserve">Look First, Volume 2: A Trip Is Not a New Life</w:t>
       </w:r>
     </w:p>
     <w:p>
@@ -13934,7 +13866,7 @@
         <w:rPr>
           <w:b/>
         </w:rPr>
-        <w:t xml:space="preserve">History</w:t>
+        <w:t xml:space="preserve">Electrical Engineering Series</w:t>
       </w:r>
     </w:p>
     <w:p>
@@ -13944,7 +13876,67 @@
         <w:jc w:val="left"/>
       </w:pPr>
       <w:r>
-        <w:t xml:space="preserve">The Dolphins' View of History</w:t>
+        <w:t xml:space="preserve">Foundations of Electronics (Book 1)</w:t>
+      </w:r>
+    </w:p>
+    <w:p>
+      <w:pPr>
+        <w:spacing w:before="0" w:after="20"/>
+        <w:ind w:left="360" w:firstLine="0" w:right="0"/>
+        <w:jc w:val="left"/>
+      </w:pPr>
+      <w:r>
+        <w:t xml:space="preserve">Circuits, Components, and Control (Book 2)</w:t>
+      </w:r>
+    </w:p>
+    <w:p>
+      <w:pPr>
+        <w:spacing w:before="0" w:after="20"/>
+        <w:ind w:left="360" w:firstLine="0" w:right="0"/>
+        <w:jc w:val="left"/>
+      </w:pPr>
+      <w:r>
+        <w:t xml:space="preserve">Semiconductor Physics and Devices (Book 3)</w:t>
+      </w:r>
+    </w:p>
+    <w:p>
+      <w:pPr>
+        <w:spacing w:before="0" w:after="20"/>
+        <w:ind w:left="360" w:firstLine="0" w:right="0"/>
+        <w:jc w:val="left"/>
+      </w:pPr>
+      <w:r>
+        <w:t xml:space="preserve">RF, Microwave, and Transceivers (Book 4)</w:t>
+      </w:r>
+    </w:p>
+    <w:p>
+      <w:pPr>
+        <w:spacing w:before="0" w:after="20"/>
+        <w:ind w:left="360" w:firstLine="0" w:right="0"/>
+        <w:jc w:val="left"/>
+      </w:pPr>
+      <w:r>
+        <w:t xml:space="preserve">Communications, Wireless, and SDR (Book 5)</w:t>
+      </w:r>
+    </w:p>
+    <w:p>
+      <w:pPr>
+        <w:spacing w:before="0" w:after="20"/>
+        <w:ind w:left="360" w:firstLine="0" w:right="0"/>
+        <w:jc w:val="left"/>
+      </w:pPr>
+      <w:r>
+        <w:t xml:space="preserve">Power and Energy (Book 6)</w:t>
+      </w:r>
+    </w:p>
+    <w:p>
+      <w:pPr>
+        <w:spacing w:before="0" w:after="20"/>
+        <w:ind w:left="360" w:firstLine="0" w:right="0"/>
+        <w:jc w:val="left"/>
+      </w:pPr>
+      <w:r>
+        <w:t xml:space="preserve">Packaging, Layout, EMC, and Test (Book 7)</w:t>
       </w:r>
     </w:p>
     <w:p>
@@ -13958,7 +13950,7 @@
         <w:rPr>
           <w:b/>
         </w:rPr>
-        <w:t xml:space="preserve">Fiction</w:t>
+        <w:t xml:space="preserve">History</w:t>
       </w:r>
     </w:p>
     <w:p>
@@ -13968,47 +13960,7 @@
         <w:jc w:val="left"/>
       </w:pPr>
       <w:r>
-        <w:t xml:space="preserve">The Murder That Hadn't Happened Yet (The Relativistic Investigation Bureau, Book 1)</w:t>
-      </w:r>
-    </w:p>
-    <w:p>
-      <w:pPr>
-        <w:spacing w:before="0" w:after="20"/>
-        <w:ind w:left="360" w:firstLine="0" w:right="0"/>
-        <w:jc w:val="left"/>
-      </w:pPr>
-      <w:r>
-        <w:t xml:space="preserve">The Warning That Was Sent Too Late (The Relativistic Investigation Bureau, Book 2)</w:t>
-      </w:r>
-    </w:p>
-    <w:p>
-      <w:pPr>
-        <w:spacing w:before="0" w:after="20"/>
-        <w:ind w:left="360" w:firstLine="0" w:right="0"/>
-        <w:jc w:val="left"/>
-      </w:pPr>
-      <w:r>
-        <w:t xml:space="preserve">Schrödinger’s Paperwork (Lolly Wren’s Curious Science Adventures, Book 1)</w:t>
-      </w:r>
-    </w:p>
-    <w:p>
-      <w:pPr>
-        <w:spacing w:before="0" w:after="20"/>
-        <w:ind w:left="360" w:firstLine="0" w:right="0"/>
-        <w:jc w:val="left"/>
-      </w:pPr>
-      <w:r>
-        <w:t xml:space="preserve">The Permitted Options (Lolly Wren’s Curious Science Adventures, Book 2)</w:t>
-      </w:r>
-    </w:p>
-    <w:p>
-      <w:pPr>
-        <w:spacing w:before="0" w:after="20"/>
-        <w:ind w:left="360" w:firstLine="0" w:right="0"/>
-        <w:jc w:val="left"/>
-      </w:pPr>
-      <w:r>
-        <w:t xml:space="preserve">Protocol Flamingo (The Invasion Storybooks, Book 1), as George Herbert Fontaine</w:t>
+        <w:t xml:space="preserve">The Dolphins’ View of History</w:t>
       </w:r>
     </w:p>
     <w:p>
@@ -14022,7 +13974,7 @@
         <w:rPr>
           <w:b/>
         </w:rPr>
-        <w:t xml:space="preserve">How-To</w:t>
+        <w:t xml:space="preserve">Fiction</w:t>
       </w:r>
     </w:p>
     <w:p>
@@ -14032,7 +13984,7 @@
         <w:jc w:val="left"/>
       </w:pPr>
       <w:r>
-        <w:t xml:space="preserve">Your First Book That Sells</w:t>
+        <w:t xml:space="preserve">The Murder That Hadn’t Happened Yet (The Relativistic Investigation Bureau, Book 1), Lothar J. Musiol writing as Spezala Genara Relavi (S.G.R.)</w:t>
       </w:r>
     </w:p>
     <w:p>
@@ -14042,7 +13994,71 @@
         <w:jc w:val="left"/>
       </w:pPr>
       <w:r>
-        <w:t xml:space="preserve">Your First YouTube Channel That Rocks</w:t>
+        <w:t xml:space="preserve">The Warning That Was Sent Too Late (The Relativistic Investigation Bureau, Book 2), Lothar J. Musiol writing as Spezala Genara Relavi (S.G.R.)</w:t>
+      </w:r>
+    </w:p>
+    <w:p>
+      <w:pPr>
+        <w:spacing w:before="0" w:after="20"/>
+        <w:ind w:left="360" w:firstLine="0" w:right="0"/>
+        <w:jc w:val="left"/>
+      </w:pPr>
+      <w:r>
+        <w:t xml:space="preserve">Schrödinger’s Paperwork (Lolly Wren’s Curious Science Adventures, Book 1), Lothar J. Musiol writing as Quentin Edmund Darling (Q.E.D.)</w:t>
+      </w:r>
+    </w:p>
+    <w:p>
+      <w:pPr>
+        <w:spacing w:before="0" w:after="20"/>
+        <w:ind w:left="360" w:firstLine="0" w:right="0"/>
+        <w:jc w:val="left"/>
+      </w:pPr>
+      <w:r>
+        <w:t xml:space="preserve">The Permitted Options (Lolly Wren’s Curious Science Adventures, Book 2), Lothar J. Musiol writing as Quentin Edmund Darling (Q.E.D.)</w:t>
+      </w:r>
+    </w:p>
+    <w:p>
+      <w:pPr>
+        <w:spacing w:before="0" w:after="20"/>
+        <w:ind w:left="360" w:firstLine="0" w:right="0"/>
+        <w:jc w:val="left"/>
+      </w:pPr>
+      <w:r>
+        <w:t xml:space="preserve">Protocol Flamingo (The Invasion Storybooks, Book 1), Lothar J. Musiol writing as George Herbert Fontaine</w:t>
+      </w:r>
+    </w:p>
+    <w:p>
+      <w:pPr>
+        <w:spacing w:before="0" w:after="20"/>
+        <w:ind w:left="360" w:firstLine="0" w:right="0"/>
+        <w:jc w:val="left"/>
+      </w:pPr>
+      <w:r>
+        <w:t xml:space="preserve">In Love with Murder, Actually: A Comic Mystery, Lothar J. Musiol writing as Romuald Livingston</w:t>
+      </w:r>
+    </w:p>
+    <w:p>
+      <w:pPr>
+        <w:keepNext/>
+        <w:spacing w:before="160" w:after="40"/>
+        <w:ind w:left="0" w:firstLine="0" w:right="0"/>
+        <w:jc w:val="left"/>
+      </w:pPr>
+      <w:r>
+        <w:rPr>
+          <w:b/>
+        </w:rPr>
+        <w:t xml:space="preserve">In German</w:t>
+      </w:r>
+    </w:p>
+    <w:p>
+      <w:pPr>
+        <w:spacing w:before="0" w:after="20"/>
+        <w:ind w:left="360" w:firstLine="0" w:right="0"/>
+        <w:jc w:val="left"/>
+      </w:pPr>
+      <w:r>
+        <w:t xml:space="preserve">Auswandern – Ab in die USA, Kanada, Australien oder Neuseeland?</w:t>
       </w:r>
     </w:p>
     <w:p>

</xml_diff>

<commit_message>
Also-by: Physics, Actually Vols 1-3 and Life, Actually to canonical list [merged onto main from book-2-lectures-after-qed 7158228, paths only]
</commit_message>
<xml_diff>
--- a/Physics, Actually - SERIES/Volume 3/Physics Vol 3 - The Standard Model, Chaos, and the Edge of Knowledge.docx
+++ b/Physics, Actually - SERIES/Volume 3/Physics Vol 3 - The Standard Model, Chaos, and the Edge of Knowledge.docx
@@ -13672,24 +13672,6 @@
         <w:jc w:val="left"/>
       </w:pPr>
       <w:r>
-        <w:t xml:space="preserve">Physics, Actually, Volume 3: The Standard Model, Chaos, and the Edge of Knowledge</w:t>
-      </w:r>
-    </w:p>
-    <w:p>
-      <w:r>
-        <w:rPr>
-          <w:b/>
-        </w:rPr>
-        <w:t>Life, Actually</w:t>
-      </w:r>
-    </w:p>
-    <w:p>
-      <w:pPr>
-        <w:spacing w:before="0" w:after="20"/>
-        <w:ind w:left="360" w:firstLine="0" w:right="0"/>
-        <w:jc w:val="left"/>
-      </w:pPr>
-      <w:r>
         <w:t xml:space="preserve">Life, Actually: From the First Cell to the Edited Genome and the Search for Life Elsewhere</w:t>
       </w:r>
     </w:p>
@@ -13704,7 +13686,7 @@
         <w:rPr>
           <w:b/>
         </w:rPr>
-        <w:t xml:space="preserve">Math, Actually</w:t>
+        <w:t xml:space="preserve">More Actually Books</w:t>
       </w:r>
     </w:p>
     <w:p>
@@ -13714,7 +13696,7 @@
         <w:jc w:val="left"/>
       </w:pPr>
       <w:r>
-        <w:t xml:space="preserve">Math, Actually, Volume 1: From Arithmetic to Calculus</w:t>
+        <w:t xml:space="preserve">Gravitation, Actually: A Short Book on Gravity</w:t>
       </w:r>
     </w:p>
     <w:p>
@@ -13724,27 +13706,7 @@
         <w:jc w:val="left"/>
       </w:pPr>
       <w:r>
-        <w:t xml:space="preserve">Math, Actually, Volume 2: From Multivariable Calculus to Set Theory &amp; Logic</w:t>
-      </w:r>
-    </w:p>
-    <w:p>
-      <w:pPr>
-        <w:spacing w:before="0" w:after="20"/>
-        <w:ind w:left="360" w:firstLine="0" w:right="0"/>
-        <w:jc w:val="left"/>
-      </w:pPr>
-      <w:r>
-        <w:t xml:space="preserve">Math, Actually, Volume 3: From Differential Equations to Abstract Algebra</w:t>
-      </w:r>
-    </w:p>
-    <w:p>
-      <w:pPr>
-        <w:spacing w:before="0" w:after="20"/>
-        <w:ind w:left="360" w:firstLine="0" w:right="0"/>
-        <w:jc w:val="left"/>
-      </w:pPr>
-      <w:r>
-        <w:t xml:space="preserve">Math, Actually, Volume 4: From Category Theory to the Frontier</w:t>
+        <w:t xml:space="preserve">The Universe, Actually: What Humanity Currently Understands About Reality</w:t>
       </w:r>
     </w:p>
     <w:p>
@@ -13758,7 +13720,7 @@
         <w:rPr>
           <w:b/>
         </w:rPr>
-        <w:t xml:space="preserve">Quantum, Actually</w:t>
+        <w:t xml:space="preserve">Math, Actually</w:t>
       </w:r>
     </w:p>
     <w:p>
@@ -13768,7 +13730,7 @@
         <w:jc w:val="left"/>
       </w:pPr>
       <w:r>
-        <w:t xml:space="preserve">Quantum, Actually, Volume 1: Questions and Answers from the Double Slit to the Superconducting Wire</w:t>
+        <w:t xml:space="preserve">Math, Actually, Volume 1: From Arithmetic to Calculus</w:t>
       </w:r>
     </w:p>
     <w:p>
@@ -13778,7 +13740,27 @@
         <w:jc w:val="left"/>
       </w:pPr>
       <w:r>
-        <w:t xml:space="preserve">Quantum, Actually, Volume 2: A QED Course</w:t>
+        <w:t xml:space="preserve">Math, Actually, Volume 2: From Multivariable Calculus to Set Theory &amp; Logic</w:t>
+      </w:r>
+    </w:p>
+    <w:p>
+      <w:pPr>
+        <w:spacing w:before="0" w:after="20"/>
+        <w:ind w:left="360" w:firstLine="0" w:right="0"/>
+        <w:jc w:val="left"/>
+      </w:pPr>
+      <w:r>
+        <w:t xml:space="preserve">Math, Actually, Volume 3: From Differential Equations to Abstract Algebra</w:t>
+      </w:r>
+    </w:p>
+    <w:p>
+      <w:pPr>
+        <w:spacing w:before="0" w:after="20"/>
+        <w:ind w:left="360" w:firstLine="0" w:right="0"/>
+        <w:jc w:val="left"/>
+      </w:pPr>
+      <w:r>
+        <w:t xml:space="preserve">Math, Actually, Volume 4: From Category Theory to the Frontier</w:t>
       </w:r>
     </w:p>
     <w:p>
@@ -13792,7 +13774,7 @@
         <w:rPr>
           <w:b/>
         </w:rPr>
-        <w:t xml:space="preserve">Science Sparks</w:t>
+        <w:t xml:space="preserve">Quantum, Actually</w:t>
       </w:r>
     </w:p>
     <w:p>
@@ -13802,7 +13784,17 @@
         <w:jc w:val="left"/>
       </w:pPr>
       <w:r>
-        <w:t xml:space="preserve">Science Sparks: Physics, Life, and Mathematics — The Same Few Rules, Told in Highlights</w:t>
+        <w:t xml:space="preserve">Quantum, Actually, Volume 1: Questions and Answers from the Double Slit to the Superconducting Wire</w:t>
+      </w:r>
+    </w:p>
+    <w:p>
+      <w:pPr>
+        <w:spacing w:before="0" w:after="20"/>
+        <w:ind w:left="360" w:firstLine="0" w:right="0"/>
+        <w:jc w:val="left"/>
+      </w:pPr>
+      <w:r>
+        <w:t xml:space="preserve">Quantum, Actually, Volume 2: A QED Course</w:t>
       </w:r>
     </w:p>
     <w:p>
@@ -13816,7 +13808,7 @@
         <w:rPr>
           <w:b/>
         </w:rPr>
-        <w:t xml:space="preserve">Look First</w:t>
+        <w:t xml:space="preserve">Science Sparks</w:t>
       </w:r>
     </w:p>
     <w:p>
@@ -13826,17 +13818,7 @@
         <w:jc w:val="left"/>
       </w:pPr>
       <w:r>
-        <w:t xml:space="preserve">Look First, Volume 1: The Universe Has No Now</w:t>
-      </w:r>
-    </w:p>
-    <w:p>
-      <w:pPr>
-        <w:spacing w:before="0" w:after="20"/>
-        <w:ind w:left="360" w:firstLine="0" w:right="0"/>
-        <w:jc w:val="left"/>
-      </w:pPr>
-      <w:r>
-        <w:t xml:space="preserve">Look First, Volume 2: A Trip Is Not a New Life</w:t>
+        <w:t xml:space="preserve">Science Sparks: Physics, Life, and Mathematics — The Same Few Rules, Told in Highlights</w:t>
       </w:r>
     </w:p>
     <w:p>
@@ -13850,7 +13832,7 @@
         <w:rPr>
           <w:b/>
         </w:rPr>
-        <w:t xml:space="preserve">Electrical Engineering Series</w:t>
+        <w:t xml:space="preserve">Look First</w:t>
       </w:r>
     </w:p>
     <w:p>
@@ -13860,7 +13842,7 @@
         <w:jc w:val="left"/>
       </w:pPr>
       <w:r>
-        <w:t xml:space="preserve">Foundations of Electronics (Book 1)</w:t>
+        <w:t xml:space="preserve">Look First, Volume 1: The Universe Has No Now</w:t>
       </w:r>
     </w:p>
     <w:p>
@@ -13870,57 +13852,7 @@
         <w:jc w:val="left"/>
       </w:pPr>
       <w:r>
-        <w:t xml:space="preserve">Circuits, Components, and Control (Book 2)</w:t>
-      </w:r>
-    </w:p>
-    <w:p>
-      <w:pPr>
-        <w:spacing w:before="0" w:after="20"/>
-        <w:ind w:left="360" w:firstLine="0" w:right="0"/>
-        <w:jc w:val="left"/>
-      </w:pPr>
-      <w:r>
-        <w:t xml:space="preserve">Semiconductor Physics and Devices (Book 3)</w:t>
-      </w:r>
-    </w:p>
-    <w:p>
-      <w:pPr>
-        <w:spacing w:before="0" w:after="20"/>
-        <w:ind w:left="360" w:firstLine="0" w:right="0"/>
-        <w:jc w:val="left"/>
-      </w:pPr>
-      <w:r>
-        <w:t xml:space="preserve">RF, Microwave, and Transceivers (Book 4)</w:t>
-      </w:r>
-    </w:p>
-    <w:p>
-      <w:pPr>
-        <w:spacing w:before="0" w:after="20"/>
-        <w:ind w:left="360" w:firstLine="0" w:right="0"/>
-        <w:jc w:val="left"/>
-      </w:pPr>
-      <w:r>
-        <w:t xml:space="preserve">Communications, Wireless, and SDR (Book 5)</w:t>
-      </w:r>
-    </w:p>
-    <w:p>
-      <w:pPr>
-        <w:spacing w:before="0" w:after="20"/>
-        <w:ind w:left="360" w:firstLine="0" w:right="0"/>
-        <w:jc w:val="left"/>
-      </w:pPr>
-      <w:r>
-        <w:t xml:space="preserve">Power and Energy (Book 6)</w:t>
-      </w:r>
-    </w:p>
-    <w:p>
-      <w:pPr>
-        <w:spacing w:before="0" w:after="20"/>
-        <w:ind w:left="360" w:firstLine="0" w:right="0"/>
-        <w:jc w:val="left"/>
-      </w:pPr>
-      <w:r>
-        <w:t xml:space="preserve">Packaging, Layout, EMC, and Test (Book 7)</w:t>
+        <w:t xml:space="preserve">Look First, Volume 2: A Trip Is Not a New Life</w:t>
       </w:r>
     </w:p>
     <w:p>
@@ -13934,7 +13866,7 @@
         <w:rPr>
           <w:b/>
         </w:rPr>
-        <w:t xml:space="preserve">History</w:t>
+        <w:t xml:space="preserve">Electrical Engineering Series</w:t>
       </w:r>
     </w:p>
     <w:p>
@@ -13944,7 +13876,67 @@
         <w:jc w:val="left"/>
       </w:pPr>
       <w:r>
-        <w:t xml:space="preserve">The Dolphins' View of History</w:t>
+        <w:t xml:space="preserve">Foundations of Electronics (Book 1)</w:t>
+      </w:r>
+    </w:p>
+    <w:p>
+      <w:pPr>
+        <w:spacing w:before="0" w:after="20"/>
+        <w:ind w:left="360" w:firstLine="0" w:right="0"/>
+        <w:jc w:val="left"/>
+      </w:pPr>
+      <w:r>
+        <w:t xml:space="preserve">Circuits, Components, and Control (Book 2)</w:t>
+      </w:r>
+    </w:p>
+    <w:p>
+      <w:pPr>
+        <w:spacing w:before="0" w:after="20"/>
+        <w:ind w:left="360" w:firstLine="0" w:right="0"/>
+        <w:jc w:val="left"/>
+      </w:pPr>
+      <w:r>
+        <w:t xml:space="preserve">Semiconductor Physics and Devices (Book 3)</w:t>
+      </w:r>
+    </w:p>
+    <w:p>
+      <w:pPr>
+        <w:spacing w:before="0" w:after="20"/>
+        <w:ind w:left="360" w:firstLine="0" w:right="0"/>
+        <w:jc w:val="left"/>
+      </w:pPr>
+      <w:r>
+        <w:t xml:space="preserve">RF, Microwave, and Transceivers (Book 4)</w:t>
+      </w:r>
+    </w:p>
+    <w:p>
+      <w:pPr>
+        <w:spacing w:before="0" w:after="20"/>
+        <w:ind w:left="360" w:firstLine="0" w:right="0"/>
+        <w:jc w:val="left"/>
+      </w:pPr>
+      <w:r>
+        <w:t xml:space="preserve">Communications, Wireless, and SDR (Book 5)</w:t>
+      </w:r>
+    </w:p>
+    <w:p>
+      <w:pPr>
+        <w:spacing w:before="0" w:after="20"/>
+        <w:ind w:left="360" w:firstLine="0" w:right="0"/>
+        <w:jc w:val="left"/>
+      </w:pPr>
+      <w:r>
+        <w:t xml:space="preserve">Power and Energy (Book 6)</w:t>
+      </w:r>
+    </w:p>
+    <w:p>
+      <w:pPr>
+        <w:spacing w:before="0" w:after="20"/>
+        <w:ind w:left="360" w:firstLine="0" w:right="0"/>
+        <w:jc w:val="left"/>
+      </w:pPr>
+      <w:r>
+        <w:t xml:space="preserve">Packaging, Layout, EMC, and Test (Book 7)</w:t>
       </w:r>
     </w:p>
     <w:p>
@@ -13958,7 +13950,7 @@
         <w:rPr>
           <w:b/>
         </w:rPr>
-        <w:t xml:space="preserve">Fiction</w:t>
+        <w:t xml:space="preserve">History</w:t>
       </w:r>
     </w:p>
     <w:p>
@@ -13968,47 +13960,7 @@
         <w:jc w:val="left"/>
       </w:pPr>
       <w:r>
-        <w:t xml:space="preserve">The Murder That Hadn't Happened Yet (The Relativistic Investigation Bureau, Book 1)</w:t>
-      </w:r>
-    </w:p>
-    <w:p>
-      <w:pPr>
-        <w:spacing w:before="0" w:after="20"/>
-        <w:ind w:left="360" w:firstLine="0" w:right="0"/>
-        <w:jc w:val="left"/>
-      </w:pPr>
-      <w:r>
-        <w:t xml:space="preserve">The Warning That Was Sent Too Late (The Relativistic Investigation Bureau, Book 2)</w:t>
-      </w:r>
-    </w:p>
-    <w:p>
-      <w:pPr>
-        <w:spacing w:before="0" w:after="20"/>
-        <w:ind w:left="360" w:firstLine="0" w:right="0"/>
-        <w:jc w:val="left"/>
-      </w:pPr>
-      <w:r>
-        <w:t xml:space="preserve">Schrödinger’s Paperwork (Lolly Wren’s Curious Science Adventures, Book 1)</w:t>
-      </w:r>
-    </w:p>
-    <w:p>
-      <w:pPr>
-        <w:spacing w:before="0" w:after="20"/>
-        <w:ind w:left="360" w:firstLine="0" w:right="0"/>
-        <w:jc w:val="left"/>
-      </w:pPr>
-      <w:r>
-        <w:t xml:space="preserve">The Permitted Options (Lolly Wren’s Curious Science Adventures, Book 2)</w:t>
-      </w:r>
-    </w:p>
-    <w:p>
-      <w:pPr>
-        <w:spacing w:before="0" w:after="20"/>
-        <w:ind w:left="360" w:firstLine="0" w:right="0"/>
-        <w:jc w:val="left"/>
-      </w:pPr>
-      <w:r>
-        <w:t xml:space="preserve">Protocol Flamingo (The Invasion Storybooks, Book 1), as George Herbert Fontaine</w:t>
+        <w:t xml:space="preserve">The Dolphins’ View of History</w:t>
       </w:r>
     </w:p>
     <w:p>
@@ -14022,7 +13974,7 @@
         <w:rPr>
           <w:b/>
         </w:rPr>
-        <w:t xml:space="preserve">How-To</w:t>
+        <w:t xml:space="preserve">Fiction</w:t>
       </w:r>
     </w:p>
     <w:p>
@@ -14032,7 +13984,7 @@
         <w:jc w:val="left"/>
       </w:pPr>
       <w:r>
-        <w:t xml:space="preserve">Your First Book That Sells</w:t>
+        <w:t xml:space="preserve">The Murder That Hadn’t Happened Yet (The Relativistic Investigation Bureau, Book 1), Lothar J. Musiol writing as Spezala Genara Relavi (S.G.R.)</w:t>
       </w:r>
     </w:p>
     <w:p>
@@ -14042,7 +13994,71 @@
         <w:jc w:val="left"/>
       </w:pPr>
       <w:r>
-        <w:t xml:space="preserve">Your First YouTube Channel That Rocks</w:t>
+        <w:t xml:space="preserve">The Warning That Was Sent Too Late (The Relativistic Investigation Bureau, Book 2), Lothar J. Musiol writing as Spezala Genara Relavi (S.G.R.)</w:t>
+      </w:r>
+    </w:p>
+    <w:p>
+      <w:pPr>
+        <w:spacing w:before="0" w:after="20"/>
+        <w:ind w:left="360" w:firstLine="0" w:right="0"/>
+        <w:jc w:val="left"/>
+      </w:pPr>
+      <w:r>
+        <w:t xml:space="preserve">Schrödinger’s Paperwork (Lolly Wren’s Curious Science Adventures, Book 1), Lothar J. Musiol writing as Quentin Edmund Darling (Q.E.D.)</w:t>
+      </w:r>
+    </w:p>
+    <w:p>
+      <w:pPr>
+        <w:spacing w:before="0" w:after="20"/>
+        <w:ind w:left="360" w:firstLine="0" w:right="0"/>
+        <w:jc w:val="left"/>
+      </w:pPr>
+      <w:r>
+        <w:t xml:space="preserve">The Permitted Options (Lolly Wren’s Curious Science Adventures, Book 2), Lothar J. Musiol writing as Quentin Edmund Darling (Q.E.D.)</w:t>
+      </w:r>
+    </w:p>
+    <w:p>
+      <w:pPr>
+        <w:spacing w:before="0" w:after="20"/>
+        <w:ind w:left="360" w:firstLine="0" w:right="0"/>
+        <w:jc w:val="left"/>
+      </w:pPr>
+      <w:r>
+        <w:t xml:space="preserve">Protocol Flamingo (The Invasion Storybooks, Book 1), Lothar J. Musiol writing as George Herbert Fontaine</w:t>
+      </w:r>
+    </w:p>
+    <w:p>
+      <w:pPr>
+        <w:spacing w:before="0" w:after="20"/>
+        <w:ind w:left="360" w:firstLine="0" w:right="0"/>
+        <w:jc w:val="left"/>
+      </w:pPr>
+      <w:r>
+        <w:t xml:space="preserve">In Love with Murder, Actually: A Comic Mystery, Lothar J. Musiol writing as Romuald Livingston</w:t>
+      </w:r>
+    </w:p>
+    <w:p>
+      <w:pPr>
+        <w:keepNext/>
+        <w:spacing w:before="160" w:after="40"/>
+        <w:ind w:left="0" w:firstLine="0" w:right="0"/>
+        <w:jc w:val="left"/>
+      </w:pPr>
+      <w:r>
+        <w:rPr>
+          <w:b/>
+        </w:rPr>
+        <w:t xml:space="preserve">In German</w:t>
+      </w:r>
+    </w:p>
+    <w:p>
+      <w:pPr>
+        <w:spacing w:before="0" w:after="20"/>
+        <w:ind w:left="360" w:firstLine="0" w:right="0"/>
+        <w:jc w:val="left"/>
+      </w:pPr>
+      <w:r>
+        <w:t xml:space="preserve">Auswandern – Ab in die USA, Kanada, Australien oder Neuseeland?</w:t>
       </w:r>
     </w:p>
     <w:p>

</xml_diff>

<commit_message>
About the Author (B): Physics, Actually Vols 1-3 and Life, Actually
</commit_message>
<xml_diff>
--- a/Physics, Actually - SERIES/Volume 3/Physics Vol 3 - The Standard Model, Chaos, and the Edge of Knowledge.docx
+++ b/Physics, Actually - SERIES/Volume 3/Physics Vol 3 - The Standard Model, Chaos, and the Edge of Knowledge.docx
@@ -13621,6 +13621,30 @@
     <w:p>
       <w:r>
         <w:br w:type="page"/>
+      </w:r>
+    </w:p>
+    <w:p>
+      <w:pPr>
+        <w:pStyle w:val="Heading1"/>
+      </w:pPr>
+      <w:r>
+        <w:t xml:space="preserve">About the Author</w:t>
+      </w:r>
+    </w:p>
+    <w:p>
+      <w:pPr>
+        <w:jc w:val="both"/>
+      </w:pPr>
+      <w:r>
+        <w:t xml:space="preserve">Lothar J. Musiol is a graduate of Munich University of Applied Sciences who spent more than forty years in the semiconductor industry, first at Germany’s largest company in the field, then at a string of American start-ups. He studied physics alongside all of it, seriously enough to know exactly how much he is simplifying. Dual citizenship, put to its most sensible use, lets him split his time between San Clemente, California, and Passau, Bavaria, where Austria begins at the garden fence. The household includes one married daughter, one grumpy Teacup Pomeranian named Gucci, and eleven chickens, listed in order of seniority rather than volume.</w:t>
+      </w:r>
+    </w:p>
+    <w:p>
+      <w:pPr>
+        <w:jc w:val="both"/>
+      </w:pPr>
+      <w:r>
+        <w:t xml:space="preserve">He writes to make complex ideas clearer and more engaging than most treatments manage, without ever pretending they are simpler than they actually are.</w:t>
       </w:r>
     </w:p>
     <w:p>

</xml_diff>

<commit_message>
About the Author (B): Physics, Actually Vols 1-3 and Life, Actually [merged onto main from book-2-lectures-after-qed 6f2d328, paths only]
</commit_message>
<xml_diff>
--- a/Physics, Actually - SERIES/Volume 3/Physics Vol 3 - The Standard Model, Chaos, and the Edge of Knowledge.docx
+++ b/Physics, Actually - SERIES/Volume 3/Physics Vol 3 - The Standard Model, Chaos, and the Edge of Knowledge.docx
@@ -13621,6 +13621,30 @@
     <w:p>
       <w:r>
         <w:br w:type="page"/>
+      </w:r>
+    </w:p>
+    <w:p>
+      <w:pPr>
+        <w:pStyle w:val="Heading1"/>
+      </w:pPr>
+      <w:r>
+        <w:t xml:space="preserve">About the Author</w:t>
+      </w:r>
+    </w:p>
+    <w:p>
+      <w:pPr>
+        <w:jc w:val="both"/>
+      </w:pPr>
+      <w:r>
+        <w:t xml:space="preserve">Lothar J. Musiol is a graduate of Munich University of Applied Sciences who spent more than forty years in the semiconductor industry, first at Germany’s largest company in the field, then at a string of American start-ups. He studied physics alongside all of it, seriously enough to know exactly how much he is simplifying. Dual citizenship, put to its most sensible use, lets him split his time between San Clemente, California, and Passau, Bavaria, where Austria begins at the garden fence. The household includes one married daughter, one grumpy Teacup Pomeranian named Gucci, and eleven chickens, listed in order of seniority rather than volume.</w:t>
+      </w:r>
+    </w:p>
+    <w:p>
+      <w:pPr>
+        <w:jc w:val="both"/>
+      </w:pPr>
+      <w:r>
+        <w:t xml:space="preserve">He writes to make complex ideas clearer and more engaging than most treatments manage, without ever pretending they are simpler than they actually are.</w:t>
       </w:r>
     </w:p>
     <w:p>

</xml_diff>

<commit_message>
TOC complete and linked + review invitation: Physics, Actually Vols 1-3
</commit_message>
<xml_diff>
--- a/Physics, Actually - SERIES/Volume 3/Physics Vol 3 - The Standard Model, Chaos, and the Edge of Knowledge.docx
+++ b/Physics, Actually - SERIES/Volume 3/Physics Vol 3 - The Standard Model, Chaos, and the Edge of Knowledge.docx
@@ -137,6 +137,48 @@
         </w:tabs>
         <w:jc w:val="left"/>
       </w:pPr>
+      <w:hyperlink w:anchor="_TocAll0001" w:history="1">
+        <w:r>
+          <w:rPr>
+            <w:color w:val="0563C1"/>
+            <w:u w:val="single"/>
+          </w:rPr>
+          <w:t xml:space="preserve">Also in This Series</w:t>
+        </w:r>
+        <w:r>
+          <w:rPr>
+            <w:color w:val="0563C1"/>
+            <w:u w:val="single"/>
+          </w:rPr>
+          <w:tab/>
+        </w:r>
+        <w:r>
+          <w:fldChar w:fldCharType="begin" w:dirty="true"/>
+        </w:r>
+        <w:r>
+          <w:instrText xml:space="preserve"> PAGEREF _TocAll0001 \h </w:instrText>
+        </w:r>
+        <w:r>
+          <w:fldChar w:fldCharType="separate"/>
+        </w:r>
+        <w:r>
+          <w:rPr>
+            <w:noProof/>
+          </w:rPr>
+          <w:t>4</w:t>
+        </w:r>
+        <w:r>
+          <w:fldChar w:fldCharType="end"/>
+        </w:r>
+      </w:hyperlink>
+    </w:p>
+    <w:p>
+      <w:pPr>
+        <w:tabs>
+          <w:tab w:val="right" w:leader="dot" w:pos="6120"/>
+        </w:tabs>
+        <w:jc w:val="left"/>
+      </w:pPr>
       <w:hyperlink w:anchor="prologue" w:history="1">
         <w:r>
           <w:rPr>
@@ -558,6 +600,48 @@
         </w:tabs>
         <w:jc w:val="left"/>
       </w:pPr>
+      <w:hyperlink w:anchor="endendofparti" w:history="1">
+        <w:r>
+          <w:rPr>
+            <w:color w:val="0563C1"/>
+            <w:u w:val="single"/>
+          </w:rPr>
+          <w:t xml:space="preserve">End of Part I — What Is Settled</w:t>
+        </w:r>
+        <w:r>
+          <w:rPr>
+            <w:color w:val="0563C1"/>
+            <w:u w:val="single"/>
+          </w:rPr>
+          <w:tab/>
+        </w:r>
+        <w:r>
+          <w:fldChar w:fldCharType="begin" w:dirty="true"/>
+        </w:r>
+        <w:r>
+          <w:instrText xml:space="preserve"> PAGEREF endendofparti \h </w:instrText>
+        </w:r>
+        <w:r>
+          <w:fldChar w:fldCharType="separate"/>
+        </w:r>
+        <w:r>
+          <w:rPr>
+            <w:noProof/>
+          </w:rPr>
+          <w:t>83</w:t>
+        </w:r>
+        <w:r>
+          <w:fldChar w:fldCharType="end"/>
+        </w:r>
+      </w:hyperlink>
+    </w:p>
+    <w:p>
+      <w:pPr>
+        <w:tabs>
+          <w:tab w:val="right" w:leader="dot" w:pos="6120"/>
+        </w:tabs>
+        <w:jc w:val="left"/>
+      </w:pPr>
       <w:hyperlink w:anchor="part2" w:history="1">
         <w:r>
           <w:rPr>
@@ -727,6 +811,48 @@
         </w:tabs>
         <w:jc w:val="left"/>
       </w:pPr>
+      <w:hyperlink w:anchor="endendofpartii" w:history="1">
+        <w:r>
+          <w:rPr>
+            <w:color w:val="0563C1"/>
+            <w:u w:val="single"/>
+          </w:rPr>
+          <w:t xml:space="preserve">End of Part II — What Is Reliable but Strange</w:t>
+        </w:r>
+        <w:r>
+          <w:rPr>
+            <w:color w:val="0563C1"/>
+            <w:u w:val="single"/>
+          </w:rPr>
+          <w:tab/>
+        </w:r>
+        <w:r>
+          <w:fldChar w:fldCharType="begin" w:dirty="true"/>
+        </w:r>
+        <w:r>
+          <w:instrText xml:space="preserve"> PAGEREF endendofpartii \h </w:instrText>
+        </w:r>
+        <w:r>
+          <w:fldChar w:fldCharType="separate"/>
+        </w:r>
+        <w:r>
+          <w:rPr>
+            <w:noProof/>
+          </w:rPr>
+          <w:t>106</w:t>
+        </w:r>
+        <w:r>
+          <w:fldChar w:fldCharType="end"/>
+        </w:r>
+      </w:hyperlink>
+    </w:p>
+    <w:p>
+      <w:pPr>
+        <w:tabs>
+          <w:tab w:val="right" w:leader="dot" w:pos="6120"/>
+        </w:tabs>
+        <w:jc w:val="left"/>
+      </w:pPr>
       <w:hyperlink w:anchor="part3" w:history="1">
         <w:r>
           <w:rPr>
@@ -896,6 +1022,48 @@
         </w:tabs>
         <w:jc w:val="left"/>
       </w:pPr>
+      <w:hyperlink w:anchor="endendofpartiii" w:history="1">
+        <w:r>
+          <w:rPr>
+            <w:color w:val="0563C1"/>
+            <w:u w:val="single"/>
+          </w:rPr>
+          <w:t xml:space="preserve">End of Part III — What Is Still a Bet</w:t>
+        </w:r>
+        <w:r>
+          <w:rPr>
+            <w:color w:val="0563C1"/>
+            <w:u w:val="single"/>
+          </w:rPr>
+          <w:tab/>
+        </w:r>
+        <w:r>
+          <w:fldChar w:fldCharType="begin" w:dirty="true"/>
+        </w:r>
+        <w:r>
+          <w:instrText xml:space="preserve"> PAGEREF endendofpartiii \h </w:instrText>
+        </w:r>
+        <w:r>
+          <w:fldChar w:fldCharType="separate"/>
+        </w:r>
+        <w:r>
+          <w:rPr>
+            <w:noProof/>
+          </w:rPr>
+          <w:t>135</w:t>
+        </w:r>
+        <w:r>
+          <w:fldChar w:fldCharType="end"/>
+        </w:r>
+      </w:hyperlink>
+    </w:p>
+    <w:p>
+      <w:pPr>
+        <w:tabs>
+          <w:tab w:val="right" w:leader="dot" w:pos="6120"/>
+        </w:tabs>
+        <w:jc w:val="left"/>
+      </w:pPr>
       <w:hyperlink w:anchor="part4" w:history="1">
         <w:r>
           <w:rPr>
@@ -1065,6 +1233,48 @@
         </w:tabs>
         <w:jc w:val="left"/>
       </w:pPr>
+      <w:hyperlink w:anchor="endendofpartiv" w:history="1">
+        <w:r>
+          <w:rPr>
+            <w:color w:val="0563C1"/>
+            <w:u w:val="single"/>
+          </w:rPr>
+          <w:t xml:space="preserve">End of Part IV — Physics Looking at Itself</w:t>
+        </w:r>
+        <w:r>
+          <w:rPr>
+            <w:color w:val="0563C1"/>
+            <w:u w:val="single"/>
+          </w:rPr>
+          <w:tab/>
+        </w:r>
+        <w:r>
+          <w:fldChar w:fldCharType="begin" w:dirty="true"/>
+        </w:r>
+        <w:r>
+          <w:instrText xml:space="preserve"> PAGEREF endendofpartiv \h </w:instrText>
+        </w:r>
+        <w:r>
+          <w:fldChar w:fldCharType="separate"/>
+        </w:r>
+        <w:r>
+          <w:rPr>
+            <w:noProof/>
+          </w:rPr>
+          <w:t>165</w:t>
+        </w:r>
+        <w:r>
+          <w:fldChar w:fldCharType="end"/>
+        </w:r>
+      </w:hyperlink>
+    </w:p>
+    <w:p>
+      <w:pPr>
+        <w:tabs>
+          <w:tab w:val="right" w:leader="dot" w:pos="6120"/>
+        </w:tabs>
+        <w:jc w:val="left"/>
+      </w:pPr>
       <w:hyperlink w:anchor="epilogue" w:history="1">
         <w:r>
           <w:rPr>
@@ -1149,6 +1359,48 @@
         </w:tabs>
         <w:jc w:val="left"/>
       </w:pPr>
+      <w:hyperlink w:anchor="_TocAll0002" w:history="1">
+        <w:r>
+          <w:rPr>
+            <w:color w:val="0563C1"/>
+            <w:u w:val="single"/>
+          </w:rPr>
+          <w:t xml:space="preserve">Core Ideas and Open Questions</w:t>
+        </w:r>
+        <w:r>
+          <w:rPr>
+            <w:color w:val="0563C1"/>
+            <w:u w:val="single"/>
+          </w:rPr>
+          <w:tab/>
+        </w:r>
+        <w:r>
+          <w:fldChar w:fldCharType="begin" w:dirty="true"/>
+        </w:r>
+        <w:r>
+          <w:instrText xml:space="preserve"> PAGEREF _TocAll0002 \h </w:instrText>
+        </w:r>
+        <w:r>
+          <w:fldChar w:fldCharType="separate"/>
+        </w:r>
+        <w:r>
+          <w:rPr>
+            <w:noProof/>
+          </w:rPr>
+          <w:t>169</w:t>
+        </w:r>
+        <w:r>
+          <w:fldChar w:fldCharType="end"/>
+        </w:r>
+      </w:hyperlink>
+    </w:p>
+    <w:p>
+      <w:pPr>
+        <w:tabs>
+          <w:tab w:val="right" w:leader="dot" w:pos="6120"/>
+        </w:tabs>
+        <w:jc w:val="left"/>
+      </w:pPr>
       <w:hyperlink w:anchor="furtherreading" w:history="1">
         <w:r>
           <w:rPr>
@@ -1226,11 +1478,139 @@
         </w:r>
       </w:hyperlink>
     </w:p>
+    <w:p>
+      <w:pPr>
+        <w:tabs>
+          <w:tab w:val="right" w:leader="dot" w:pos="6120"/>
+        </w:tabs>
+        <w:jc w:val="left"/>
+      </w:pPr>
+      <w:hyperlink w:anchor="_TocAll0003" w:history="1">
+        <w:r>
+          <w:rPr>
+            <w:color w:val="0563C1"/>
+            <w:u w:val="single"/>
+          </w:rPr>
+          <w:t xml:space="preserve">About the Author</w:t>
+        </w:r>
+        <w:r>
+          <w:rPr>
+            <w:color w:val="0563C1"/>
+            <w:u w:val="single"/>
+          </w:rPr>
+          <w:tab/>
+        </w:r>
+        <w:r>
+          <w:fldChar w:fldCharType="begin" w:dirty="true"/>
+        </w:r>
+        <w:r>
+          <w:instrText xml:space="preserve"> PAGEREF _TocAll0003 \h </w:instrText>
+        </w:r>
+        <w:r>
+          <w:fldChar w:fldCharType="separate"/>
+        </w:r>
+        <w:r>
+          <w:rPr>
+            <w:noProof/>
+          </w:rPr>
+          <w:t>185</w:t>
+        </w:r>
+        <w:r>
+          <w:fldChar w:fldCharType="end"/>
+        </w:r>
+      </w:hyperlink>
+    </w:p>
+    <w:p>
+      <w:pPr>
+        <w:tabs>
+          <w:tab w:val="right" w:leader="dot" w:pos="6120"/>
+        </w:tabs>
+        <w:jc w:val="left"/>
+      </w:pPr>
+      <w:hyperlink w:anchor="_TocAll0004" w:history="1">
+        <w:r>
+          <w:rPr>
+            <w:color w:val="0563C1"/>
+            <w:u w:val="single"/>
+          </w:rPr>
+          <w:t xml:space="preserve">Also by Lothar J. Musiol</w:t>
+        </w:r>
+        <w:r>
+          <w:rPr>
+            <w:color w:val="0563C1"/>
+            <w:u w:val="single"/>
+          </w:rPr>
+          <w:tab/>
+        </w:r>
+        <w:r>
+          <w:fldChar w:fldCharType="begin" w:dirty="true"/>
+        </w:r>
+        <w:r>
+          <w:instrText xml:space="preserve"> PAGEREF _TocAll0004 \h </w:instrText>
+        </w:r>
+        <w:r>
+          <w:fldChar w:fldCharType="separate"/>
+        </w:r>
+        <w:r>
+          <w:rPr>
+            <w:noProof/>
+          </w:rPr>
+          <w:t>185</w:t>
+        </w:r>
+        <w:r>
+          <w:fldChar w:fldCharType="end"/>
+        </w:r>
+      </w:hyperlink>
+    </w:p>
+    <w:p>
+      <w:pPr>
+        <w:tabs>
+          <w:tab w:val="right" w:leader="dot" w:pos="6120"/>
+        </w:tabs>
+        <w:jc w:val="left"/>
+      </w:pPr>
+      <w:hyperlink w:anchor="note" w:history="1">
+        <w:r>
+          <w:rPr>
+            <w:color w:val="0563C1"/>
+            <w:u w:val="single"/>
+          </w:rPr>
+          <w:t xml:space="preserve">A Note Before You Go</w:t>
+        </w:r>
+        <w:r>
+          <w:rPr>
+            <w:color w:val="0563C1"/>
+            <w:u w:val="single"/>
+          </w:rPr>
+          <w:tab/>
+        </w:r>
+        <w:r>
+          <w:fldChar w:fldCharType="begin" w:dirty="true"/>
+        </w:r>
+        <w:r>
+          <w:instrText xml:space="preserve"> PAGEREF note \h </w:instrText>
+        </w:r>
+        <w:r>
+          <w:fldChar w:fldCharType="separate"/>
+        </w:r>
+        <w:r>
+          <w:rPr>
+            <w:noProof/>
+          </w:rPr>
+          <w:t>188</w:t>
+        </w:r>
+        <w:r>
+          <w:fldChar w:fldCharType="end"/>
+        </w:r>
+      </w:hyperlink>
+    </w:p>
     <w:p/>
     <w:p>
       <w:pPr>
         <w:pStyle w:val="Heading1"/>
       </w:pPr>
+      <w:bookmarkStart w:id="233" w:name="_TocAll0001"/>
+      <w:bookmarkEnd w:id="233"/>
       <w:r>
         <w:t xml:space="preserve">Also in This Series</w:t>
       </w:r>
@@ -12262,6 +12642,8 @@
       <w:pPr>
         <w:pStyle w:val="Heading1"/>
       </w:pPr>
+      <w:bookmarkStart w:id="234" w:name="_TocAll0002"/>
+      <w:bookmarkEnd w:id="234"/>
       <w:r>
         <w:t xml:space="preserve">Core Ideas and Open Questions</w:t>
       </w:r>
@@ -13625,8 +14007,27 @@
     </w:p>
     <w:p>
       <w:pPr>
+        <w:jc w:val="both"/>
+      </w:pPr>
+      <w:r>
+        <w:rPr>
+          <w:i/>
+          <w:iCs/>
+        </w:rPr>
+        <w:t xml:space="preserve">If this book gave you something, a laugh, an idea, or a better question, I’d love to hear about it. A short review on Amazon, even a sentence or two, helps other curious readers find it, and I read every one.</w:t>
+      </w:r>
+    </w:p>
+    <w:p>
+      <w:r>
+        <w:br w:type="page"/>
+      </w:r>
+    </w:p>
+    <w:p>
+      <w:pPr>
         <w:pStyle w:val="Heading1"/>
       </w:pPr>
+      <w:bookmarkStart w:id="235" w:name="_TocAll0003"/>
+      <w:bookmarkEnd w:id="235"/>
       <w:r>
         <w:t xml:space="preserve">About the Author</w:t>
       </w:r>
@@ -13651,6 +14052,8 @@
       <w:pPr>
         <w:pStyle w:val="Heading1"/>
       </w:pPr>
+      <w:bookmarkStart w:id="236" w:name="_TocAll0004"/>
+      <w:bookmarkEnd w:id="236"/>
       <w:r>
         <w:t xml:space="preserve">Also by Lothar J. Musiol</w:t>
       </w:r>

</xml_diff>

<commit_message>
TOC complete and linked + review invitation: Physics, Actually Vols 1-3 [merged onto main from book-2-lectures-after-qed fe6c41d, paths only]
</commit_message>
<xml_diff>
--- a/Physics, Actually - SERIES/Volume 3/Physics Vol 3 - The Standard Model, Chaos, and the Edge of Knowledge.docx
+++ b/Physics, Actually - SERIES/Volume 3/Physics Vol 3 - The Standard Model, Chaos, and the Edge of Knowledge.docx
@@ -137,6 +137,48 @@
         </w:tabs>
         <w:jc w:val="left"/>
       </w:pPr>
+      <w:hyperlink w:anchor="_TocAll0001" w:history="1">
+        <w:r>
+          <w:rPr>
+            <w:color w:val="0563C1"/>
+            <w:u w:val="single"/>
+          </w:rPr>
+          <w:t xml:space="preserve">Also in This Series</w:t>
+        </w:r>
+        <w:r>
+          <w:rPr>
+            <w:color w:val="0563C1"/>
+            <w:u w:val="single"/>
+          </w:rPr>
+          <w:tab/>
+        </w:r>
+        <w:r>
+          <w:fldChar w:fldCharType="begin" w:dirty="true"/>
+        </w:r>
+        <w:r>
+          <w:instrText xml:space="preserve"> PAGEREF _TocAll0001 \h </w:instrText>
+        </w:r>
+        <w:r>
+          <w:fldChar w:fldCharType="separate"/>
+        </w:r>
+        <w:r>
+          <w:rPr>
+            <w:noProof/>
+          </w:rPr>
+          <w:t>4</w:t>
+        </w:r>
+        <w:r>
+          <w:fldChar w:fldCharType="end"/>
+        </w:r>
+      </w:hyperlink>
+    </w:p>
+    <w:p>
+      <w:pPr>
+        <w:tabs>
+          <w:tab w:val="right" w:leader="dot" w:pos="6120"/>
+        </w:tabs>
+        <w:jc w:val="left"/>
+      </w:pPr>
       <w:hyperlink w:anchor="prologue" w:history="1">
         <w:r>
           <w:rPr>
@@ -558,6 +600,48 @@
         </w:tabs>
         <w:jc w:val="left"/>
       </w:pPr>
+      <w:hyperlink w:anchor="endendofparti" w:history="1">
+        <w:r>
+          <w:rPr>
+            <w:color w:val="0563C1"/>
+            <w:u w:val="single"/>
+          </w:rPr>
+          <w:t xml:space="preserve">End of Part I — What Is Settled</w:t>
+        </w:r>
+        <w:r>
+          <w:rPr>
+            <w:color w:val="0563C1"/>
+            <w:u w:val="single"/>
+          </w:rPr>
+          <w:tab/>
+        </w:r>
+        <w:r>
+          <w:fldChar w:fldCharType="begin" w:dirty="true"/>
+        </w:r>
+        <w:r>
+          <w:instrText xml:space="preserve"> PAGEREF endendofparti \h </w:instrText>
+        </w:r>
+        <w:r>
+          <w:fldChar w:fldCharType="separate"/>
+        </w:r>
+        <w:r>
+          <w:rPr>
+            <w:noProof/>
+          </w:rPr>
+          <w:t>83</w:t>
+        </w:r>
+        <w:r>
+          <w:fldChar w:fldCharType="end"/>
+        </w:r>
+      </w:hyperlink>
+    </w:p>
+    <w:p>
+      <w:pPr>
+        <w:tabs>
+          <w:tab w:val="right" w:leader="dot" w:pos="6120"/>
+        </w:tabs>
+        <w:jc w:val="left"/>
+      </w:pPr>
       <w:hyperlink w:anchor="part2" w:history="1">
         <w:r>
           <w:rPr>
@@ -727,6 +811,48 @@
         </w:tabs>
         <w:jc w:val="left"/>
       </w:pPr>
+      <w:hyperlink w:anchor="endendofpartii" w:history="1">
+        <w:r>
+          <w:rPr>
+            <w:color w:val="0563C1"/>
+            <w:u w:val="single"/>
+          </w:rPr>
+          <w:t xml:space="preserve">End of Part II — What Is Reliable but Strange</w:t>
+        </w:r>
+        <w:r>
+          <w:rPr>
+            <w:color w:val="0563C1"/>
+            <w:u w:val="single"/>
+          </w:rPr>
+          <w:tab/>
+        </w:r>
+        <w:r>
+          <w:fldChar w:fldCharType="begin" w:dirty="true"/>
+        </w:r>
+        <w:r>
+          <w:instrText xml:space="preserve"> PAGEREF endendofpartii \h </w:instrText>
+        </w:r>
+        <w:r>
+          <w:fldChar w:fldCharType="separate"/>
+        </w:r>
+        <w:r>
+          <w:rPr>
+            <w:noProof/>
+          </w:rPr>
+          <w:t>106</w:t>
+        </w:r>
+        <w:r>
+          <w:fldChar w:fldCharType="end"/>
+        </w:r>
+      </w:hyperlink>
+    </w:p>
+    <w:p>
+      <w:pPr>
+        <w:tabs>
+          <w:tab w:val="right" w:leader="dot" w:pos="6120"/>
+        </w:tabs>
+        <w:jc w:val="left"/>
+      </w:pPr>
       <w:hyperlink w:anchor="part3" w:history="1">
         <w:r>
           <w:rPr>
@@ -896,6 +1022,48 @@
         </w:tabs>
         <w:jc w:val="left"/>
       </w:pPr>
+      <w:hyperlink w:anchor="endendofpartiii" w:history="1">
+        <w:r>
+          <w:rPr>
+            <w:color w:val="0563C1"/>
+            <w:u w:val="single"/>
+          </w:rPr>
+          <w:t xml:space="preserve">End of Part III — What Is Still a Bet</w:t>
+        </w:r>
+        <w:r>
+          <w:rPr>
+            <w:color w:val="0563C1"/>
+            <w:u w:val="single"/>
+          </w:rPr>
+          <w:tab/>
+        </w:r>
+        <w:r>
+          <w:fldChar w:fldCharType="begin" w:dirty="true"/>
+        </w:r>
+        <w:r>
+          <w:instrText xml:space="preserve"> PAGEREF endendofpartiii \h </w:instrText>
+        </w:r>
+        <w:r>
+          <w:fldChar w:fldCharType="separate"/>
+        </w:r>
+        <w:r>
+          <w:rPr>
+            <w:noProof/>
+          </w:rPr>
+          <w:t>135</w:t>
+        </w:r>
+        <w:r>
+          <w:fldChar w:fldCharType="end"/>
+        </w:r>
+      </w:hyperlink>
+    </w:p>
+    <w:p>
+      <w:pPr>
+        <w:tabs>
+          <w:tab w:val="right" w:leader="dot" w:pos="6120"/>
+        </w:tabs>
+        <w:jc w:val="left"/>
+      </w:pPr>
       <w:hyperlink w:anchor="part4" w:history="1">
         <w:r>
           <w:rPr>
@@ -1065,6 +1233,48 @@
         </w:tabs>
         <w:jc w:val="left"/>
       </w:pPr>
+      <w:hyperlink w:anchor="endendofpartiv" w:history="1">
+        <w:r>
+          <w:rPr>
+            <w:color w:val="0563C1"/>
+            <w:u w:val="single"/>
+          </w:rPr>
+          <w:t xml:space="preserve">End of Part IV — Physics Looking at Itself</w:t>
+        </w:r>
+        <w:r>
+          <w:rPr>
+            <w:color w:val="0563C1"/>
+            <w:u w:val="single"/>
+          </w:rPr>
+          <w:tab/>
+        </w:r>
+        <w:r>
+          <w:fldChar w:fldCharType="begin" w:dirty="true"/>
+        </w:r>
+        <w:r>
+          <w:instrText xml:space="preserve"> PAGEREF endendofpartiv \h </w:instrText>
+        </w:r>
+        <w:r>
+          <w:fldChar w:fldCharType="separate"/>
+        </w:r>
+        <w:r>
+          <w:rPr>
+            <w:noProof/>
+          </w:rPr>
+          <w:t>165</w:t>
+        </w:r>
+        <w:r>
+          <w:fldChar w:fldCharType="end"/>
+        </w:r>
+      </w:hyperlink>
+    </w:p>
+    <w:p>
+      <w:pPr>
+        <w:tabs>
+          <w:tab w:val="right" w:leader="dot" w:pos="6120"/>
+        </w:tabs>
+        <w:jc w:val="left"/>
+      </w:pPr>
       <w:hyperlink w:anchor="epilogue" w:history="1">
         <w:r>
           <w:rPr>
@@ -1149,6 +1359,48 @@
         </w:tabs>
         <w:jc w:val="left"/>
       </w:pPr>
+      <w:hyperlink w:anchor="_TocAll0002" w:history="1">
+        <w:r>
+          <w:rPr>
+            <w:color w:val="0563C1"/>
+            <w:u w:val="single"/>
+          </w:rPr>
+          <w:t xml:space="preserve">Core Ideas and Open Questions</w:t>
+        </w:r>
+        <w:r>
+          <w:rPr>
+            <w:color w:val="0563C1"/>
+            <w:u w:val="single"/>
+          </w:rPr>
+          <w:tab/>
+        </w:r>
+        <w:r>
+          <w:fldChar w:fldCharType="begin" w:dirty="true"/>
+        </w:r>
+        <w:r>
+          <w:instrText xml:space="preserve"> PAGEREF _TocAll0002 \h </w:instrText>
+        </w:r>
+        <w:r>
+          <w:fldChar w:fldCharType="separate"/>
+        </w:r>
+        <w:r>
+          <w:rPr>
+            <w:noProof/>
+          </w:rPr>
+          <w:t>169</w:t>
+        </w:r>
+        <w:r>
+          <w:fldChar w:fldCharType="end"/>
+        </w:r>
+      </w:hyperlink>
+    </w:p>
+    <w:p>
+      <w:pPr>
+        <w:tabs>
+          <w:tab w:val="right" w:leader="dot" w:pos="6120"/>
+        </w:tabs>
+        <w:jc w:val="left"/>
+      </w:pPr>
       <w:hyperlink w:anchor="furtherreading" w:history="1">
         <w:r>
           <w:rPr>
@@ -1226,11 +1478,139 @@
         </w:r>
       </w:hyperlink>
     </w:p>
+    <w:p>
+      <w:pPr>
+        <w:tabs>
+          <w:tab w:val="right" w:leader="dot" w:pos="6120"/>
+        </w:tabs>
+        <w:jc w:val="left"/>
+      </w:pPr>
+      <w:hyperlink w:anchor="_TocAll0003" w:history="1">
+        <w:r>
+          <w:rPr>
+            <w:color w:val="0563C1"/>
+            <w:u w:val="single"/>
+          </w:rPr>
+          <w:t xml:space="preserve">About the Author</w:t>
+        </w:r>
+        <w:r>
+          <w:rPr>
+            <w:color w:val="0563C1"/>
+            <w:u w:val="single"/>
+          </w:rPr>
+          <w:tab/>
+        </w:r>
+        <w:r>
+          <w:fldChar w:fldCharType="begin" w:dirty="true"/>
+        </w:r>
+        <w:r>
+          <w:instrText xml:space="preserve"> PAGEREF _TocAll0003 \h </w:instrText>
+        </w:r>
+        <w:r>
+          <w:fldChar w:fldCharType="separate"/>
+        </w:r>
+        <w:r>
+          <w:rPr>
+            <w:noProof/>
+          </w:rPr>
+          <w:t>185</w:t>
+        </w:r>
+        <w:r>
+          <w:fldChar w:fldCharType="end"/>
+        </w:r>
+      </w:hyperlink>
+    </w:p>
+    <w:p>
+      <w:pPr>
+        <w:tabs>
+          <w:tab w:val="right" w:leader="dot" w:pos="6120"/>
+        </w:tabs>
+        <w:jc w:val="left"/>
+      </w:pPr>
+      <w:hyperlink w:anchor="_TocAll0004" w:history="1">
+        <w:r>
+          <w:rPr>
+            <w:color w:val="0563C1"/>
+            <w:u w:val="single"/>
+          </w:rPr>
+          <w:t xml:space="preserve">Also by Lothar J. Musiol</w:t>
+        </w:r>
+        <w:r>
+          <w:rPr>
+            <w:color w:val="0563C1"/>
+            <w:u w:val="single"/>
+          </w:rPr>
+          <w:tab/>
+        </w:r>
+        <w:r>
+          <w:fldChar w:fldCharType="begin" w:dirty="true"/>
+        </w:r>
+        <w:r>
+          <w:instrText xml:space="preserve"> PAGEREF _TocAll0004 \h </w:instrText>
+        </w:r>
+        <w:r>
+          <w:fldChar w:fldCharType="separate"/>
+        </w:r>
+        <w:r>
+          <w:rPr>
+            <w:noProof/>
+          </w:rPr>
+          <w:t>185</w:t>
+        </w:r>
+        <w:r>
+          <w:fldChar w:fldCharType="end"/>
+        </w:r>
+      </w:hyperlink>
+    </w:p>
+    <w:p>
+      <w:pPr>
+        <w:tabs>
+          <w:tab w:val="right" w:leader="dot" w:pos="6120"/>
+        </w:tabs>
+        <w:jc w:val="left"/>
+      </w:pPr>
+      <w:hyperlink w:anchor="note" w:history="1">
+        <w:r>
+          <w:rPr>
+            <w:color w:val="0563C1"/>
+            <w:u w:val="single"/>
+          </w:rPr>
+          <w:t xml:space="preserve">A Note Before You Go</w:t>
+        </w:r>
+        <w:r>
+          <w:rPr>
+            <w:color w:val="0563C1"/>
+            <w:u w:val="single"/>
+          </w:rPr>
+          <w:tab/>
+        </w:r>
+        <w:r>
+          <w:fldChar w:fldCharType="begin" w:dirty="true"/>
+        </w:r>
+        <w:r>
+          <w:instrText xml:space="preserve"> PAGEREF note \h </w:instrText>
+        </w:r>
+        <w:r>
+          <w:fldChar w:fldCharType="separate"/>
+        </w:r>
+        <w:r>
+          <w:rPr>
+            <w:noProof/>
+          </w:rPr>
+          <w:t>188</w:t>
+        </w:r>
+        <w:r>
+          <w:fldChar w:fldCharType="end"/>
+        </w:r>
+      </w:hyperlink>
+    </w:p>
     <w:p/>
     <w:p>
       <w:pPr>
         <w:pStyle w:val="Heading1"/>
       </w:pPr>
+      <w:bookmarkStart w:id="233" w:name="_TocAll0001"/>
+      <w:bookmarkEnd w:id="233"/>
       <w:r>
         <w:t xml:space="preserve">Also in This Series</w:t>
       </w:r>
@@ -12262,6 +12642,8 @@
       <w:pPr>
         <w:pStyle w:val="Heading1"/>
       </w:pPr>
+      <w:bookmarkStart w:id="234" w:name="_TocAll0002"/>
+      <w:bookmarkEnd w:id="234"/>
       <w:r>
         <w:t xml:space="preserve">Core Ideas and Open Questions</w:t>
       </w:r>
@@ -13625,8 +14007,27 @@
     </w:p>
     <w:p>
       <w:pPr>
+        <w:jc w:val="both"/>
+      </w:pPr>
+      <w:r>
+        <w:rPr>
+          <w:i/>
+          <w:iCs/>
+        </w:rPr>
+        <w:t xml:space="preserve">If this book gave you something, a laugh, an idea, or a better question, I’d love to hear about it. A short review on Amazon, even a sentence or two, helps other curious readers find it, and I read every one.</w:t>
+      </w:r>
+    </w:p>
+    <w:p>
+      <w:r>
+        <w:br w:type="page"/>
+      </w:r>
+    </w:p>
+    <w:p>
+      <w:pPr>
         <w:pStyle w:val="Heading1"/>
       </w:pPr>
+      <w:bookmarkStart w:id="235" w:name="_TocAll0003"/>
+      <w:bookmarkEnd w:id="235"/>
       <w:r>
         <w:t xml:space="preserve">About the Author</w:t>
       </w:r>
@@ -13651,6 +14052,8 @@
       <w:pPr>
         <w:pStyle w:val="Heading1"/>
       </w:pPr>
+      <w:bookmarkStart w:id="236" w:name="_TocAll0004"/>
+      <w:bookmarkEnd w:id="236"/>
       <w:r>
         <w:t xml:space="preserve">Also by Lothar J. Musiol</w:t>
       </w:r>

</xml_diff>